<commit_message>
feat: dashboard estudiantes completo + reset credenciales masivo
</commit_message>
<xml_diff>
--- a/📄 CREDENCIALES GENERADAS maestros.docx
+++ b/📄 CREDENCIALES GENERADAS maestros.docx
@@ -2,213 +2,1020 @@
 <file path=word/document.xml><?xml version="1.0" encoding="utf-8"?>
 <w:document xmlns:wpc="http://schemas.microsoft.com/office/word/2010/wordprocessingCanvas" xmlns:cx="http://schemas.microsoft.com/office/drawing/2014/chartex" xmlns:cx1="http://schemas.microsoft.com/office/drawing/2015/9/8/chartex" xmlns:cx2="http://schemas.microsoft.com/office/drawing/2015/10/21/chartex" xmlns:cx3="http://schemas.microsoft.com/office/drawing/2016/5/9/chartex" xmlns:cx4="http://schemas.microsoft.com/office/drawing/2016/5/10/chartex" xmlns:cx5="http://schemas.microsoft.com/office/drawing/2016/5/11/chartex" xmlns:cx6="http://schemas.microsoft.com/office/drawing/2016/5/12/chartex" xmlns:cx7="http://schemas.microsoft.com/office/drawing/2016/5/13/chartex" xmlns:cx8="http://schemas.microsoft.com/office/drawing/2016/5/14/chartex" xmlns:mc="http://schemas.openxmlformats.org/markup-compatibility/2006" xmlns:aink="http://schemas.microsoft.com/office/drawing/2016/ink" xmlns:am3d="http://schemas.microsoft.com/office/drawing/2017/model3d" xmlns:o="urn:schemas-microsoft-com:office:office" xmlns:oel="http://schemas.microsoft.com/office/2019/extlst" xmlns:r="http://schemas.openxmlformats.org/officeDocument/2006/relationships" xmlns:m="http://schemas.openxmlformats.org/officeDocument/2006/math" xmlns:v="urn:schemas-microsoft-com:vml" xmlns:wp14="http://schemas.microsoft.com/office/word/2010/wordprocessingDrawing" xmlns:wp="http://schemas.openxmlformats.org/drawingml/2006/wordprocessingDrawing" xmlns:w10="urn:schemas-microsoft-com:office:word" xmlns:w="http://schemas.openxmlformats.org/wordprocessingml/2006/main" xmlns:w14="http://schemas.microsoft.com/office/word/2010/wordml" xmlns:w15="http://schemas.microsoft.com/office/word/2012/wordml" xmlns:w16cex="http://schemas.microsoft.com/office/word/2018/wordml/cex" xmlns:w16cid="http://schemas.microsoft.com/office/word/2016/wordml/cid" xmlns:w16="http://schemas.microsoft.com/office/word/2018/wordml" xmlns:w16du="http://schemas.microsoft.com/office/word/2023/wordml/word16du" xmlns:w16sdtdh="http://schemas.microsoft.com/office/word/2020/wordml/sdtdatahash" xmlns:w16sdtfl="http://schemas.microsoft.com/office/word/2024/wordml/sdtformatlock" xmlns:w16se="http://schemas.microsoft.com/office/word/2015/wordml/symex" xmlns:wpg="http://schemas.microsoft.com/office/word/2010/wordprocessingGroup" xmlns:wpi="http://schemas.microsoft.com/office/word/2010/wordprocessingInk" xmlns:wne="http://schemas.microsoft.com/office/word/2006/wordml" xmlns:wps="http://schemas.microsoft.com/office/word/2010/wordprocessingShape" mc:Ignorable="w14 w15 w16se w16cid w16 w16cex w16sdtdh w16sdtfl w16du wp14">
   <w:body>
-    <w:p/>
-    <w:p>
+    <w:p>
+      <w:pPr>
+        <w:rPr>
+          <w:rFonts w:ascii="Arial" w:hAnsi="Arial" w:cs="Arial"/>
+          <w:sz w:val="16"/>
+          <w:szCs w:val="16"/>
+        </w:rPr>
+      </w:pPr>
+    </w:p>
+    <w:p>
+      <w:pPr>
+        <w:rPr>
+          <w:rFonts w:ascii="Arial" w:hAnsi="Arial" w:cs="Arial"/>
+          <w:sz w:val="16"/>
+          <w:szCs w:val="16"/>
+        </w:rPr>
+      </w:pPr>
       <w:r>
         <w:rPr>
           <w:rFonts w:ascii="Segoe UI Emoji" w:hAnsi="Segoe UI Emoji" w:cs="Segoe UI Emoji"/>
+          <w:sz w:val="16"/>
+          <w:szCs w:val="16"/>
         </w:rPr>
         <w:t>📄</w:t>
       </w:r>
       <w:r>
+        <w:rPr>
+          <w:rFonts w:ascii="Arial" w:hAnsi="Arial" w:cs="Arial"/>
+          <w:sz w:val="16"/>
+          <w:szCs w:val="16"/>
+        </w:rPr>
         <w:t xml:space="preserve"> CREDENCIALES GENERADAS:</w:t>
       </w:r>
-    </w:p>
-    <w:p>
-      <w:r>
-        <w:t>Nombre                          Email                           Contraseña</w:t>
-      </w:r>
-    </w:p>
-    <w:p>
-      <w:r>
+      <w:r>
+        <w:rPr>
+          <w:rFonts w:ascii="Arial" w:hAnsi="Arial" w:cs="Arial"/>
+          <w:sz w:val="16"/>
+          <w:szCs w:val="16"/>
+        </w:rPr>
+        <w:t xml:space="preserve"> EN LA NUBE</w:t>
+      </w:r>
+    </w:p>
+    <w:p>
+      <w:pPr>
+        <w:rPr>
+          <w:rFonts w:ascii="Arial" w:hAnsi="Arial" w:cs="Arial"/>
+          <w:sz w:val="16"/>
+          <w:szCs w:val="16"/>
+        </w:rPr>
+      </w:pPr>
+      <w:r>
+        <w:rPr>
+          <w:rFonts w:ascii="Arial" w:hAnsi="Arial" w:cs="Arial"/>
+          <w:sz w:val="16"/>
+          <w:szCs w:val="16"/>
+        </w:rPr>
+        <w:t xml:space="preserve">Nombre                          </w:t>
+      </w:r>
+      <w:r>
+        <w:rPr>
+          <w:rFonts w:ascii="Arial" w:hAnsi="Arial" w:cs="Arial"/>
+          <w:sz w:val="16"/>
+          <w:szCs w:val="16"/>
+        </w:rPr>
+        <w:tab/>
+      </w:r>
+      <w:r>
+        <w:rPr>
+          <w:rFonts w:ascii="Arial" w:hAnsi="Arial" w:cs="Arial"/>
+          <w:sz w:val="16"/>
+          <w:szCs w:val="16"/>
+        </w:rPr>
+        <w:tab/>
+      </w:r>
+      <w:r>
+        <w:rPr>
+          <w:rFonts w:ascii="Arial" w:hAnsi="Arial" w:cs="Arial"/>
+          <w:sz w:val="16"/>
+          <w:szCs w:val="16"/>
+        </w:rPr>
+        <w:t xml:space="preserve">Email                           </w:t>
+      </w:r>
+      <w:r>
+        <w:rPr>
+          <w:rFonts w:ascii="Arial" w:hAnsi="Arial" w:cs="Arial"/>
+          <w:sz w:val="16"/>
+          <w:szCs w:val="16"/>
+        </w:rPr>
+        <w:tab/>
+      </w:r>
+      <w:r>
+        <w:rPr>
+          <w:rFonts w:ascii="Arial" w:hAnsi="Arial" w:cs="Arial"/>
+          <w:sz w:val="16"/>
+          <w:szCs w:val="16"/>
+        </w:rPr>
+        <w:tab/>
+      </w:r>
+      <w:r>
+        <w:rPr>
+          <w:rFonts w:ascii="Arial" w:hAnsi="Arial" w:cs="Arial"/>
+          <w:sz w:val="16"/>
+          <w:szCs w:val="16"/>
+        </w:rPr>
+        <w:t>Contraseña</w:t>
+      </w:r>
+    </w:p>
+    <w:p>
+      <w:pPr>
+        <w:rPr>
+          <w:rFonts w:ascii="Arial" w:hAnsi="Arial" w:cs="Arial"/>
+          <w:sz w:val="16"/>
+          <w:szCs w:val="16"/>
+        </w:rPr>
+      </w:pPr>
+      <w:r>
+        <w:rPr>
+          <w:rFonts w:ascii="Arial" w:hAnsi="Arial" w:cs="Arial"/>
+          <w:sz w:val="16"/>
+          <w:szCs w:val="16"/>
+        </w:rPr>
         <w:t>────────────────────────────────────────────────────────────────────────────────</w:t>
       </w:r>
     </w:p>
     <w:p>
-      <w:r>
+      <w:pPr>
+        <w:rPr>
+          <w:rFonts w:ascii="Arial" w:hAnsi="Arial" w:cs="Arial"/>
+          <w:sz w:val="16"/>
+          <w:szCs w:val="16"/>
+        </w:rPr>
+      </w:pPr>
+      <w:r>
+        <w:rPr>
+          <w:rFonts w:ascii="Arial" w:hAnsi="Arial" w:cs="Arial"/>
+          <w:sz w:val="16"/>
+          <w:szCs w:val="16"/>
+        </w:rPr>
         <w:t>CALLEJAS CABRERA ARMINDA        arminda.callejas@nnuu.edu.bo    maestro02072026</w:t>
       </w:r>
     </w:p>
     <w:p>
-      <w:r>
+      <w:pPr>
+        <w:rPr>
+          <w:rFonts w:ascii="Arial" w:hAnsi="Arial" w:cs="Arial"/>
+          <w:sz w:val="16"/>
+          <w:szCs w:val="16"/>
+        </w:rPr>
+      </w:pPr>
+      <w:r>
+        <w:rPr>
+          <w:rFonts w:ascii="Arial" w:hAnsi="Arial" w:cs="Arial"/>
+          <w:sz w:val="16"/>
+          <w:szCs w:val="16"/>
+        </w:rPr>
         <w:t>CALLEJAS CABRERA ROSSE MERY     rosse.callejas@nnuu.edu.bo      maestrocall2026</w:t>
       </w:r>
     </w:p>
     <w:p>
-      <w:r>
+      <w:pPr>
+        <w:rPr>
+          <w:rFonts w:ascii="Arial" w:hAnsi="Arial" w:cs="Arial"/>
+          <w:sz w:val="16"/>
+          <w:szCs w:val="16"/>
+        </w:rPr>
+      </w:pPr>
+      <w:r>
+        <w:rPr>
+          <w:rFonts w:ascii="Arial" w:hAnsi="Arial" w:cs="Arial"/>
+          <w:sz w:val="16"/>
+          <w:szCs w:val="16"/>
+        </w:rPr>
         <w:t>CORTEZ CONTRERAS YENY   yeny.cortez@nnuu.edu.bo maestrocort2026</w:t>
       </w:r>
     </w:p>
     <w:p>
-      <w:r>
+      <w:pPr>
+        <w:rPr>
+          <w:rFonts w:ascii="Arial" w:hAnsi="Arial" w:cs="Arial"/>
+          <w:sz w:val="16"/>
+          <w:szCs w:val="16"/>
+        </w:rPr>
+      </w:pPr>
+      <w:r>
+        <w:rPr>
+          <w:rFonts w:ascii="Arial" w:hAnsi="Arial" w:cs="Arial"/>
+          <w:sz w:val="16"/>
+          <w:szCs w:val="16"/>
+        </w:rPr>
         <w:t xml:space="preserve">CUELLAR GARNICA </w:t>
       </w:r>
       <w:proofErr w:type="gramStart"/>
       <w:r>
+        <w:rPr>
+          <w:rFonts w:ascii="Arial" w:hAnsi="Arial" w:cs="Arial"/>
+          <w:sz w:val="16"/>
+          <w:szCs w:val="16"/>
+        </w:rPr>
         <w:t>ISABEL  isabel.cuellar@nnuu.edu.bo</w:t>
       </w:r>
       <w:proofErr w:type="gramEnd"/>
       <w:r>
+        <w:rPr>
+          <w:rFonts w:ascii="Arial" w:hAnsi="Arial" w:cs="Arial"/>
+          <w:sz w:val="16"/>
+          <w:szCs w:val="16"/>
+        </w:rPr>
         <w:t xml:space="preserve">      maestrocuel2026</w:t>
       </w:r>
     </w:p>
     <w:p>
-      <w:r>
+      <w:pPr>
+        <w:rPr>
+          <w:rFonts w:ascii="Arial" w:hAnsi="Arial" w:cs="Arial"/>
+          <w:sz w:val="16"/>
+          <w:szCs w:val="16"/>
+        </w:rPr>
+      </w:pPr>
+      <w:r>
+        <w:rPr>
+          <w:rFonts w:ascii="Arial" w:hAnsi="Arial" w:cs="Arial"/>
+          <w:sz w:val="16"/>
+          <w:szCs w:val="16"/>
+        </w:rPr>
         <w:t>FERREL GONZALES LORENZO lorenzo.ferrel@nnuu.edu.bo      maestro81532026</w:t>
       </w:r>
     </w:p>
     <w:p>
-      <w:r>
+      <w:pPr>
+        <w:rPr>
+          <w:rFonts w:ascii="Arial" w:hAnsi="Arial" w:cs="Arial"/>
+          <w:sz w:val="16"/>
+          <w:szCs w:val="16"/>
+        </w:rPr>
+      </w:pPr>
+      <w:r>
+        <w:rPr>
+          <w:rFonts w:ascii="Arial" w:hAnsi="Arial" w:cs="Arial"/>
+          <w:sz w:val="16"/>
+          <w:szCs w:val="16"/>
+        </w:rPr>
         <w:t xml:space="preserve">FLORES MANGUTA </w:t>
       </w:r>
       <w:proofErr w:type="gramStart"/>
       <w:r>
+        <w:rPr>
+          <w:rFonts w:ascii="Arial" w:hAnsi="Arial" w:cs="Arial"/>
+          <w:sz w:val="16"/>
+          <w:szCs w:val="16"/>
+        </w:rPr>
         <w:t>EMANUEL  emanuel.flores@nnuu.edu.bo</w:t>
       </w:r>
       <w:proofErr w:type="gramEnd"/>
       <w:r>
+        <w:rPr>
+          <w:rFonts w:ascii="Arial" w:hAnsi="Arial" w:cs="Arial"/>
+          <w:sz w:val="16"/>
+          <w:szCs w:val="16"/>
+        </w:rPr>
         <w:t xml:space="preserve">      maestro28692026</w:t>
       </w:r>
     </w:p>
     <w:p>
-      <w:r>
+      <w:pPr>
+        <w:rPr>
+          <w:rFonts w:ascii="Arial" w:hAnsi="Arial" w:cs="Arial"/>
+          <w:sz w:val="16"/>
+          <w:szCs w:val="16"/>
+        </w:rPr>
+      </w:pPr>
+      <w:r>
+        <w:rPr>
+          <w:rFonts w:ascii="Arial" w:hAnsi="Arial" w:cs="Arial"/>
+          <w:sz w:val="16"/>
+          <w:szCs w:val="16"/>
+        </w:rPr>
         <w:t>FLORES OSINAGA JUAN CARLOS      juan.flores1@nnuu.edu.bo        maestro27702026</w:t>
       </w:r>
     </w:p>
     <w:p>
-      <w:r>
+      <w:pPr>
+        <w:rPr>
+          <w:rFonts w:ascii="Arial" w:hAnsi="Arial" w:cs="Arial"/>
+          <w:sz w:val="16"/>
+          <w:szCs w:val="16"/>
+        </w:rPr>
+      </w:pPr>
+      <w:r>
+        <w:rPr>
+          <w:rFonts w:ascii="Arial" w:hAnsi="Arial" w:cs="Arial"/>
+          <w:sz w:val="16"/>
+          <w:szCs w:val="16"/>
+        </w:rPr>
         <w:t>MAMANI GIRA NANCY       nancy.mamani1@nnuu.edu.bo       maestro34802026</w:t>
       </w:r>
     </w:p>
     <w:p>
-      <w:r>
+      <w:pPr>
+        <w:rPr>
+          <w:rFonts w:ascii="Arial" w:hAnsi="Arial" w:cs="Arial"/>
+          <w:sz w:val="16"/>
+          <w:szCs w:val="16"/>
+        </w:rPr>
+      </w:pPr>
+      <w:r>
+        <w:rPr>
+          <w:rFonts w:ascii="Arial" w:hAnsi="Arial" w:cs="Arial"/>
+          <w:sz w:val="16"/>
+          <w:szCs w:val="16"/>
+        </w:rPr>
         <w:t>MELENDRES GALVIS BLANCA DOLLY   blanca.melendres@nnuu.edu.bo    maestromele2026</w:t>
       </w:r>
     </w:p>
     <w:p>
-      <w:r>
+      <w:pPr>
+        <w:rPr>
+          <w:rFonts w:ascii="Arial" w:hAnsi="Arial" w:cs="Arial"/>
+          <w:sz w:val="16"/>
+          <w:szCs w:val="16"/>
+        </w:rPr>
+      </w:pPr>
+      <w:r>
+        <w:rPr>
+          <w:rFonts w:ascii="Arial" w:hAnsi="Arial" w:cs="Arial"/>
+          <w:sz w:val="16"/>
+          <w:szCs w:val="16"/>
+        </w:rPr>
         <w:t xml:space="preserve">MENACHO </w:t>
       </w:r>
       <w:proofErr w:type="gramStart"/>
       <w:r>
+        <w:rPr>
+          <w:rFonts w:ascii="Arial" w:hAnsi="Arial" w:cs="Arial"/>
+          <w:sz w:val="16"/>
+          <w:szCs w:val="16"/>
+        </w:rPr>
         <w:t>SOLAR  AIDE</w:t>
       </w:r>
       <w:proofErr w:type="gramEnd"/>
       <w:r>
+        <w:rPr>
+          <w:rFonts w:ascii="Arial" w:hAnsi="Arial" w:cs="Arial"/>
+          <w:sz w:val="16"/>
+          <w:szCs w:val="16"/>
+        </w:rPr>
         <w:t xml:space="preserve">     aide.menacho@nnuu.edu.bo        maestromena2026</w:t>
       </w:r>
     </w:p>
     <w:p>
-      <w:r>
+      <w:pPr>
+        <w:rPr>
+          <w:rFonts w:ascii="Arial" w:hAnsi="Arial" w:cs="Arial"/>
+          <w:sz w:val="16"/>
+          <w:szCs w:val="16"/>
+        </w:rPr>
+      </w:pPr>
+      <w:r>
+        <w:rPr>
+          <w:rFonts w:ascii="Arial" w:hAnsi="Arial" w:cs="Arial"/>
+          <w:sz w:val="16"/>
+          <w:szCs w:val="16"/>
+        </w:rPr>
         <w:t xml:space="preserve">MOLINA SOSSA </w:t>
       </w:r>
       <w:proofErr w:type="gramStart"/>
       <w:r>
+        <w:rPr>
+          <w:rFonts w:ascii="Arial" w:hAnsi="Arial" w:cs="Arial"/>
+          <w:sz w:val="16"/>
+          <w:szCs w:val="16"/>
+        </w:rPr>
         <w:t>PRUDENCIO  prudencio.molina@nnuu.edu.bo</w:t>
       </w:r>
       <w:proofErr w:type="gramEnd"/>
       <w:r>
+        <w:rPr>
+          <w:rFonts w:ascii="Arial" w:hAnsi="Arial" w:cs="Arial"/>
+          <w:sz w:val="16"/>
+          <w:szCs w:val="16"/>
+        </w:rPr>
         <w:t xml:space="preserve">    maestro37162026</w:t>
       </w:r>
     </w:p>
     <w:p>
-      <w:r>
+      <w:pPr>
+        <w:rPr>
+          <w:rFonts w:ascii="Arial" w:hAnsi="Arial" w:cs="Arial"/>
+          <w:sz w:val="16"/>
+          <w:szCs w:val="16"/>
+        </w:rPr>
+      </w:pPr>
+      <w:r>
+        <w:rPr>
+          <w:rFonts w:ascii="Arial" w:hAnsi="Arial" w:cs="Arial"/>
+          <w:sz w:val="16"/>
+          <w:szCs w:val="16"/>
+        </w:rPr>
         <w:t>NEGRETE MONTENEGRO ANA RUTH     ana.negrete@nnuu.edu.bo maestro69292026</w:t>
       </w:r>
     </w:p>
     <w:p>
-      <w:r>
+      <w:pPr>
+        <w:rPr>
+          <w:rFonts w:ascii="Arial" w:hAnsi="Arial" w:cs="Arial"/>
+          <w:sz w:val="16"/>
+          <w:szCs w:val="16"/>
+        </w:rPr>
+      </w:pPr>
+      <w:r>
+        <w:rPr>
+          <w:rFonts w:ascii="Arial" w:hAnsi="Arial" w:cs="Arial"/>
+          <w:sz w:val="16"/>
+          <w:szCs w:val="16"/>
+        </w:rPr>
         <w:t>RAMOS BENITO JANET SHIRLEY      janet.ramos@nnuu.edu.bo maestroramo2026</w:t>
       </w:r>
     </w:p>
     <w:p>
-      <w:r>
+      <w:pPr>
+        <w:rPr>
+          <w:rFonts w:ascii="Arial" w:hAnsi="Arial" w:cs="Arial"/>
+          <w:sz w:val="16"/>
+          <w:szCs w:val="16"/>
+        </w:rPr>
+      </w:pPr>
+      <w:r>
+        <w:rPr>
+          <w:rFonts w:ascii="Arial" w:hAnsi="Arial" w:cs="Arial"/>
+          <w:sz w:val="16"/>
+          <w:szCs w:val="16"/>
+        </w:rPr>
         <w:t>RAMOS VILLEGAS CONSUELO MILENKA consuelo.ramos1@nnuu.edu.bo     maestro38142026</w:t>
       </w:r>
     </w:p>
     <w:p>
-      <w:r>
+      <w:pPr>
+        <w:rPr>
+          <w:rFonts w:ascii="Arial" w:hAnsi="Arial" w:cs="Arial"/>
+          <w:sz w:val="16"/>
+          <w:szCs w:val="16"/>
+        </w:rPr>
+      </w:pPr>
+      <w:r>
+        <w:rPr>
+          <w:rFonts w:ascii="Arial" w:hAnsi="Arial" w:cs="Arial"/>
+          <w:sz w:val="16"/>
+          <w:szCs w:val="16"/>
+        </w:rPr>
         <w:t>ROJAS CASTRO ARMINDA    arminda.rojas@nnuu.edu.bo       maestro51982026</w:t>
       </w:r>
     </w:p>
     <w:p>
-      <w:r>
+      <w:pPr>
+        <w:rPr>
+          <w:rFonts w:ascii="Arial" w:hAnsi="Arial" w:cs="Arial"/>
+          <w:sz w:val="16"/>
+          <w:szCs w:val="16"/>
+        </w:rPr>
+      </w:pPr>
+      <w:r>
+        <w:rPr>
+          <w:rFonts w:ascii="Arial" w:hAnsi="Arial" w:cs="Arial"/>
+          <w:sz w:val="16"/>
+          <w:szCs w:val="16"/>
+        </w:rPr>
         <w:t>ROSALES HUARANCA YESSENIA       yessenia.rosales@nnuu.edu.bo    maestrorosa2026</w:t>
       </w:r>
     </w:p>
     <w:p>
-      <w:r>
+      <w:pPr>
+        <w:rPr>
+          <w:rFonts w:ascii="Arial" w:hAnsi="Arial" w:cs="Arial"/>
+          <w:sz w:val="16"/>
+          <w:szCs w:val="16"/>
+        </w:rPr>
+      </w:pPr>
+      <w:r>
+        <w:rPr>
+          <w:rFonts w:ascii="Arial" w:hAnsi="Arial" w:cs="Arial"/>
+          <w:sz w:val="16"/>
+          <w:szCs w:val="16"/>
+        </w:rPr>
         <w:t>SOTO CAMARA VICTOR      victor.soto1@nnuu.edu.bo        maestro13142026</w:t>
       </w:r>
     </w:p>
     <w:p>
-      <w:r>
+      <w:pPr>
+        <w:rPr>
+          <w:rFonts w:ascii="Arial" w:hAnsi="Arial" w:cs="Arial"/>
+          <w:sz w:val="16"/>
+          <w:szCs w:val="16"/>
+        </w:rPr>
+      </w:pPr>
+      <w:r>
+        <w:rPr>
+          <w:rFonts w:ascii="Arial" w:hAnsi="Arial" w:cs="Arial"/>
+          <w:sz w:val="16"/>
+          <w:szCs w:val="16"/>
+        </w:rPr>
         <w:t>TORO CASTRO FLORINDA    florinda.toro@nnuu.edu.bo       maestro73332026</w:t>
       </w:r>
     </w:p>
     <w:p>
+      <w:pPr>
+        <w:rPr>
+          <w:rFonts w:ascii="Arial" w:hAnsi="Arial" w:cs="Arial"/>
+          <w:sz w:val="16"/>
+          <w:szCs w:val="16"/>
+        </w:rPr>
+      </w:pPr>
       <w:proofErr w:type="gramStart"/>
       <w:r>
-        <w:lastRenderedPageBreak/>
+        <w:rPr>
+          <w:rFonts w:ascii="Arial" w:hAnsi="Arial" w:cs="Arial"/>
+          <w:sz w:val="16"/>
+          <w:szCs w:val="16"/>
+        </w:rPr>
         <w:t>VILLAGOMEZ  JUANSITO</w:t>
       </w:r>
       <w:proofErr w:type="gramEnd"/>
       <w:r>
+        <w:rPr>
+          <w:rFonts w:ascii="Arial" w:hAnsi="Arial" w:cs="Arial"/>
+          <w:sz w:val="16"/>
+          <w:szCs w:val="16"/>
+        </w:rPr>
         <w:t xml:space="preserve">    juansito.villagomez@nnuu.edu.bo maestrovill2026</w:t>
       </w:r>
     </w:p>
     <w:p>
-      <w:r>
+      <w:pPr>
+        <w:rPr>
+          <w:rFonts w:ascii="Arial" w:hAnsi="Arial" w:cs="Arial"/>
+          <w:sz w:val="16"/>
+          <w:szCs w:val="16"/>
+        </w:rPr>
+      </w:pPr>
+      <w:r>
+        <w:rPr>
+          <w:rFonts w:ascii="Arial" w:hAnsi="Arial" w:cs="Arial"/>
+          <w:sz w:val="16"/>
+          <w:szCs w:val="16"/>
+        </w:rPr>
         <w:t xml:space="preserve">VILLAGOMEZ LINO </w:t>
       </w:r>
       <w:proofErr w:type="gramStart"/>
       <w:r>
+        <w:rPr>
+          <w:rFonts w:ascii="Arial" w:hAnsi="Arial" w:cs="Arial"/>
+          <w:sz w:val="16"/>
+          <w:szCs w:val="16"/>
+        </w:rPr>
         <w:t>BENITA  benita.villagomez@nnuu.edu.bo</w:t>
       </w:r>
       <w:proofErr w:type="gramEnd"/>
       <w:r>
+        <w:rPr>
+          <w:rFonts w:ascii="Arial" w:hAnsi="Arial" w:cs="Arial"/>
+          <w:sz w:val="16"/>
+          <w:szCs w:val="16"/>
+        </w:rPr>
         <w:t xml:space="preserve">   maestro79252026</w:t>
       </w:r>
     </w:p>
     <w:p>
-      <w:r>
+      <w:pPr>
+        <w:rPr>
+          <w:rFonts w:ascii="Arial" w:hAnsi="Arial" w:cs="Arial"/>
+          <w:sz w:val="16"/>
+          <w:szCs w:val="16"/>
+        </w:rPr>
+      </w:pPr>
+      <w:r>
+        <w:rPr>
+          <w:rFonts w:ascii="Arial" w:hAnsi="Arial" w:cs="Arial"/>
+          <w:sz w:val="16"/>
+          <w:szCs w:val="16"/>
+        </w:rPr>
         <w:t>VILLAGOMEZ LINO OSCAR   oscar.villagomez@nnuu.edu.bo    maestro23132026</w:t>
       </w:r>
     </w:p>
     <w:p>
-      <w:r>
+      <w:pPr>
+        <w:rPr>
+          <w:rFonts w:ascii="Arial" w:hAnsi="Arial" w:cs="Arial"/>
+          <w:sz w:val="16"/>
+          <w:szCs w:val="16"/>
+        </w:rPr>
+      </w:pPr>
+      <w:r>
+        <w:rPr>
+          <w:rFonts w:ascii="Arial" w:hAnsi="Arial" w:cs="Arial"/>
+          <w:sz w:val="16"/>
+          <w:szCs w:val="16"/>
+        </w:rPr>
         <w:t>ZABALA FARELL MERCY     mercy.zabala@nnuu.edu.bo        maestro09372026</w:t>
       </w:r>
     </w:p>
     <w:p>
-      <w:r>
+      <w:pPr>
+        <w:rPr>
+          <w:rFonts w:ascii="Arial" w:hAnsi="Arial" w:cs="Arial"/>
+          <w:sz w:val="16"/>
+          <w:szCs w:val="16"/>
+        </w:rPr>
+      </w:pPr>
+      <w:r>
+        <w:rPr>
+          <w:rFonts w:ascii="Arial" w:hAnsi="Arial" w:cs="Arial"/>
+          <w:sz w:val="16"/>
+          <w:szCs w:val="16"/>
+        </w:rPr>
         <w:t xml:space="preserve">ZAMBRANA COCA </w:t>
       </w:r>
       <w:proofErr w:type="gramStart"/>
       <w:r>
+        <w:rPr>
+          <w:rFonts w:ascii="Arial" w:hAnsi="Arial" w:cs="Arial"/>
+          <w:sz w:val="16"/>
+          <w:szCs w:val="16"/>
+        </w:rPr>
         <w:t>FILOMENA  filomena.zambrana1@nnuu.edu.bo</w:t>
       </w:r>
       <w:proofErr w:type="gramEnd"/>
       <w:r>
+        <w:rPr>
+          <w:rFonts w:ascii="Arial" w:hAnsi="Arial" w:cs="Arial"/>
+          <w:sz w:val="16"/>
+          <w:szCs w:val="16"/>
+        </w:rPr>
         <w:t xml:space="preserve">  maestrozamb2026</w:t>
       </w:r>
     </w:p>
     <w:p>
-      <w:r>
+      <w:pPr>
+        <w:rPr>
+          <w:rFonts w:ascii="Arial" w:hAnsi="Arial" w:cs="Arial"/>
+          <w:sz w:val="16"/>
+          <w:szCs w:val="16"/>
+        </w:rPr>
+      </w:pPr>
+      <w:r>
+        <w:rPr>
+          <w:rFonts w:ascii="Arial" w:hAnsi="Arial" w:cs="Arial"/>
+          <w:sz w:val="16"/>
+          <w:szCs w:val="16"/>
+        </w:rPr>
         <w:t>ZAMBRANA ORELLANA CECILIA       cecilia.zambrana@nnuu.edu.bo    maestro12562026</w:t>
       </w:r>
     </w:p>
     <w:p>
-      <w:r>
+      <w:pPr>
+        <w:rPr>
+          <w:rFonts w:ascii="Arial" w:hAnsi="Arial" w:cs="Arial"/>
+          <w:sz w:val="16"/>
+          <w:szCs w:val="16"/>
+        </w:rPr>
+      </w:pPr>
+      <w:r>
+        <w:rPr>
+          <w:rFonts w:ascii="Arial" w:hAnsi="Arial" w:cs="Arial"/>
+          <w:sz w:val="16"/>
+          <w:szCs w:val="16"/>
+        </w:rPr>
         <w:t xml:space="preserve">ZARATE SALAZAR </w:t>
       </w:r>
       <w:proofErr w:type="gramStart"/>
       <w:r>
+        <w:rPr>
+          <w:rFonts w:ascii="Arial" w:hAnsi="Arial" w:cs="Arial"/>
+          <w:sz w:val="16"/>
+          <w:szCs w:val="16"/>
+        </w:rPr>
         <w:t>SORAIDA  soraida.zarate@nnuu.edu.bo</w:t>
       </w:r>
       <w:proofErr w:type="gramEnd"/>
       <w:r>
+        <w:rPr>
+          <w:rFonts w:ascii="Arial" w:hAnsi="Arial" w:cs="Arial"/>
+          <w:sz w:val="16"/>
+          <w:szCs w:val="16"/>
+        </w:rPr>
         <w:t xml:space="preserve">      maestro30272026</w:t>
+      </w:r>
+    </w:p>
+    <w:p>
+      <w:pPr>
+        <w:rPr>
+          <w:rFonts w:ascii="Arial" w:hAnsi="Arial" w:cs="Arial"/>
+          <w:sz w:val="16"/>
+          <w:szCs w:val="16"/>
+        </w:rPr>
+      </w:pPr>
+    </w:p>
+    <w:p>
+      <w:pPr>
+        <w:rPr>
+          <w:rFonts w:ascii="Arial" w:hAnsi="Arial" w:cs="Arial"/>
+          <w:sz w:val="16"/>
+          <w:szCs w:val="16"/>
+        </w:rPr>
+      </w:pPr>
+    </w:p>
+    <w:p>
+      <w:pPr>
+        <w:rPr>
+          <w:rFonts w:ascii="Arial" w:hAnsi="Arial" w:cs="Arial"/>
+          <w:sz w:val="16"/>
+          <w:szCs w:val="16"/>
+        </w:rPr>
+      </w:pPr>
+      <w:r>
+        <w:rPr>
+          <w:rFonts w:ascii="Arial" w:hAnsi="Arial" w:cs="Arial"/>
+          <w:sz w:val="16"/>
+          <w:szCs w:val="16"/>
+        </w:rPr>
+        <w:t xml:space="preserve">Maestro: HERMENEGILDA SOLIZ TAPIA Email: </w:t>
+      </w:r>
+      <w:hyperlink r:id="rId4" w:history="1">
+        <w:r>
+          <w:rPr>
+            <w:rStyle w:val="Hipervnculo"/>
+            <w:rFonts w:ascii="Arial" w:hAnsi="Arial" w:cs="Arial"/>
+            <w:sz w:val="16"/>
+            <w:szCs w:val="16"/>
+          </w:rPr>
+          <w:t>hermenegilda.soliz@nnuu.edu.bo</w:t>
+        </w:r>
+      </w:hyperlink>
+      <w:r>
+        <w:rPr>
+          <w:rFonts w:ascii="Arial" w:hAnsi="Arial" w:cs="Arial"/>
+          <w:sz w:val="16"/>
+          <w:szCs w:val="16"/>
+        </w:rPr>
+        <w:t xml:space="preserve"> </w:t>
+      </w:r>
+      <w:r>
+        <w:rPr>
+          <w:rFonts w:ascii="Arial" w:hAnsi="Arial" w:cs="Arial"/>
+          <w:sz w:val="16"/>
+          <w:szCs w:val="16"/>
+        </w:rPr>
+        <w:t>Contraseña: maestroSOLI2026</w:t>
+      </w:r>
+    </w:p>
+    <w:p>
+      <w:pPr>
+        <w:rPr>
+          <w:rFonts w:ascii="Arial" w:hAnsi="Arial" w:cs="Arial"/>
+          <w:sz w:val="16"/>
+          <w:szCs w:val="16"/>
+        </w:rPr>
+      </w:pPr>
+      <w:r>
+        <w:rPr>
+          <w:rFonts w:ascii="Arial" w:hAnsi="Arial" w:cs="Arial"/>
+          <w:sz w:val="16"/>
+          <w:szCs w:val="16"/>
+        </w:rPr>
+        <w:t>Maestro: DAVID CUELLAR</w:t>
+      </w:r>
+      <w:r>
+        <w:rPr>
+          <w:rFonts w:ascii="Arial" w:hAnsi="Arial" w:cs="Arial"/>
+          <w:sz w:val="16"/>
+          <w:szCs w:val="16"/>
+        </w:rPr>
+        <w:t xml:space="preserve"> </w:t>
+      </w:r>
+      <w:r>
+        <w:rPr>
+          <w:rFonts w:ascii="Arial" w:hAnsi="Arial" w:cs="Arial"/>
+          <w:sz w:val="16"/>
+          <w:szCs w:val="16"/>
+        </w:rPr>
+        <w:t xml:space="preserve">Email: </w:t>
+      </w:r>
+      <w:hyperlink r:id="rId5" w:history="1">
+        <w:r>
+          <w:rPr>
+            <w:rStyle w:val="Hipervnculo"/>
+            <w:rFonts w:ascii="Arial" w:hAnsi="Arial" w:cs="Arial"/>
+            <w:sz w:val="16"/>
+            <w:szCs w:val="16"/>
+          </w:rPr>
+          <w:t>david.cuellar@nnuu.edu.bo</w:t>
+        </w:r>
+      </w:hyperlink>
+      <w:r>
+        <w:rPr>
+          <w:rFonts w:ascii="Arial" w:hAnsi="Arial" w:cs="Arial"/>
+          <w:sz w:val="16"/>
+          <w:szCs w:val="16"/>
+        </w:rPr>
+        <w:t xml:space="preserve"> </w:t>
+      </w:r>
+      <w:r>
+        <w:rPr>
+          <w:rFonts w:ascii="Arial" w:hAnsi="Arial" w:cs="Arial"/>
+          <w:sz w:val="16"/>
+          <w:szCs w:val="16"/>
+        </w:rPr>
+        <w:t>Contraseña: maestroCUEL2026</w:t>
+      </w:r>
+    </w:p>
+    <w:p>
+      <w:pPr>
+        <w:rPr>
+          <w:rFonts w:ascii="Arial" w:hAnsi="Arial" w:cs="Arial"/>
+          <w:sz w:val="16"/>
+          <w:szCs w:val="16"/>
+        </w:rPr>
+      </w:pPr>
+      <w:r>
+        <w:rPr>
+          <w:rFonts w:ascii="Arial" w:hAnsi="Arial" w:cs="Arial"/>
+          <w:sz w:val="16"/>
+          <w:szCs w:val="16"/>
+        </w:rPr>
+        <w:t xml:space="preserve">Maestro: HERMENEGILDA SOLIZ TAPIA Email: </w:t>
+      </w:r>
+      <w:hyperlink r:id="rId6" w:history="1">
+        <w:r>
+          <w:rPr>
+            <w:rStyle w:val="Hipervnculo"/>
+            <w:rFonts w:ascii="Arial" w:hAnsi="Arial" w:cs="Arial"/>
+            <w:sz w:val="16"/>
+            <w:szCs w:val="16"/>
+          </w:rPr>
+          <w:t>hermenegilda.soliz@nnuu.edu.bo</w:t>
+        </w:r>
+      </w:hyperlink>
+      <w:r>
+        <w:rPr>
+          <w:rFonts w:ascii="Arial" w:hAnsi="Arial" w:cs="Arial"/>
+          <w:sz w:val="16"/>
+          <w:szCs w:val="16"/>
+        </w:rPr>
+        <w:t xml:space="preserve"> </w:t>
+      </w:r>
+      <w:r>
+        <w:rPr>
+          <w:rFonts w:ascii="Arial" w:hAnsi="Arial" w:cs="Arial"/>
+          <w:sz w:val="16"/>
+          <w:szCs w:val="16"/>
+        </w:rPr>
+        <w:t>Contraseña: maestroSOLI2026</w:t>
+      </w:r>
+    </w:p>
+    <w:p>
+      <w:pPr>
+        <w:rPr>
+          <w:rFonts w:ascii="Arial" w:hAnsi="Arial" w:cs="Arial"/>
+          <w:sz w:val="16"/>
+          <w:szCs w:val="16"/>
+        </w:rPr>
+      </w:pPr>
+    </w:p>
+    <w:p>
+      <w:pPr>
+        <w:rPr>
+          <w:rFonts w:ascii="Arial" w:hAnsi="Arial" w:cs="Arial"/>
+          <w:sz w:val="16"/>
+          <w:szCs w:val="16"/>
+        </w:rPr>
+      </w:pPr>
+    </w:p>
+    <w:p>
+      <w:pPr>
+        <w:rPr>
+          <w:rFonts w:ascii="Arial" w:hAnsi="Arial" w:cs="Arial"/>
+          <w:sz w:val="16"/>
+          <w:szCs w:val="16"/>
+        </w:rPr>
+      </w:pPr>
+    </w:p>
+    <w:p>
+      <w:pPr>
+        <w:rPr>
+          <w:rFonts w:ascii="Arial" w:hAnsi="Arial" w:cs="Arial"/>
+          <w:sz w:val="16"/>
+          <w:szCs w:val="16"/>
+        </w:rPr>
+      </w:pPr>
+    </w:p>
+    <w:p>
+      <w:pPr>
+        <w:rPr>
+          <w:rFonts w:ascii="Arial" w:hAnsi="Arial" w:cs="Arial"/>
+          <w:sz w:val="16"/>
+          <w:szCs w:val="16"/>
+        </w:rPr>
+      </w:pPr>
+    </w:p>
+    <w:p>
+      <w:pPr>
+        <w:jc w:val="center"/>
+        <w:rPr>
+          <w:rFonts w:ascii="Arial" w:hAnsi="Arial" w:cs="Arial"/>
+          <w:sz w:val="16"/>
+          <w:szCs w:val="16"/>
+        </w:rPr>
+      </w:pPr>
+      <w:r>
+        <w:rPr>
+          <w:rFonts w:ascii="Arial" w:hAnsi="Arial" w:cs="Arial"/>
+          <w:sz w:val="16"/>
+          <w:szCs w:val="16"/>
+        </w:rPr>
+        <w:t>CREDENCIALES GENERADAS:</w:t>
+      </w:r>
+      <w:r>
+        <w:rPr>
+          <w:rFonts w:ascii="Arial" w:hAnsi="Arial" w:cs="Arial"/>
+          <w:sz w:val="16"/>
+          <w:szCs w:val="16"/>
+        </w:rPr>
+        <w:t xml:space="preserve"> </w:t>
+      </w:r>
+      <w:r>
+        <w:rPr>
+          <w:rFonts w:ascii="Arial" w:hAnsi="Arial" w:cs="Arial"/>
+          <w:sz w:val="16"/>
+          <w:szCs w:val="16"/>
+        </w:rPr>
+        <w:t>LOCAL</w:t>
+      </w:r>
+    </w:p>
+    <w:p>
+      <w:pPr>
+        <w:rPr>
+          <w:rFonts w:ascii="Arial" w:hAnsi="Arial" w:cs="Arial"/>
+          <w:sz w:val="16"/>
+          <w:szCs w:val="16"/>
+        </w:rPr>
+      </w:pPr>
+      <w:r>
+        <w:rPr>
+          <w:rFonts w:ascii="Arial" w:hAnsi="Arial" w:cs="Arial"/>
+          <w:sz w:val="16"/>
+          <w:szCs w:val="16"/>
+          <w:lang w:val="en-US"/>
+        </w:rPr>
+        <w:t xml:space="preserve">ROSS MERY </w:t>
+      </w:r>
+      <w:proofErr w:type="gramStart"/>
+      <w:r>
+        <w:rPr>
+          <w:rFonts w:ascii="Arial" w:hAnsi="Arial" w:cs="Arial"/>
+          <w:sz w:val="16"/>
+          <w:szCs w:val="16"/>
+          <w:lang w:val="en-US"/>
+        </w:rPr>
+        <w:t>CALLEJAS :</w:t>
+      </w:r>
+      <w:proofErr w:type="gramEnd"/>
+      <w:r>
+        <w:rPr>
+          <w:rFonts w:ascii="Arial" w:hAnsi="Arial" w:cs="Arial"/>
+          <w:sz w:val="16"/>
+          <w:szCs w:val="16"/>
+          <w:lang w:val="en-US"/>
+        </w:rPr>
+        <w:t xml:space="preserve">  </w:t>
+      </w:r>
+      <w:r>
+        <w:rPr>
+          <w:rFonts w:ascii="Arial" w:hAnsi="Arial" w:cs="Arial"/>
+          <w:sz w:val="16"/>
+          <w:szCs w:val="16"/>
+          <w:lang w:val="en-US"/>
+        </w:rPr>
+        <w:t xml:space="preserve">Email: </w:t>
+      </w:r>
+      <w:hyperlink r:id="rId7" w:history="1">
+        <w:r>
+          <w:rPr>
+            <w:rStyle w:val="Hipervnculo"/>
+            <w:rFonts w:ascii="Arial" w:hAnsi="Arial" w:cs="Arial"/>
+            <w:sz w:val="16"/>
+            <w:szCs w:val="16"/>
+            <w:lang w:val="en-US"/>
+          </w:rPr>
+          <w:t>rosse.callejas@nnuu.edu.bo</w:t>
+        </w:r>
+      </w:hyperlink>
+      <w:r>
+        <w:rPr>
+          <w:rFonts w:ascii="Arial" w:hAnsi="Arial" w:cs="Arial"/>
+          <w:sz w:val="16"/>
+          <w:szCs w:val="16"/>
+          <w:lang w:val="en-US"/>
+        </w:rPr>
+        <w:t xml:space="preserve">  C</w:t>
+      </w:r>
+      <w:proofErr w:type="spellStart"/>
+      <w:r>
+        <w:rPr>
+          <w:rFonts w:ascii="Arial" w:hAnsi="Arial" w:cs="Arial"/>
+          <w:sz w:val="16"/>
+          <w:szCs w:val="16"/>
+        </w:rPr>
+        <w:t>ontraseña</w:t>
+      </w:r>
+      <w:proofErr w:type="spellEnd"/>
+      <w:r>
+        <w:rPr>
+          <w:rFonts w:ascii="Arial" w:hAnsi="Arial" w:cs="Arial"/>
+          <w:sz w:val="16"/>
+          <w:szCs w:val="16"/>
+        </w:rPr>
+        <w:t>: nnuu2026618</w:t>
       </w:r>
     </w:p>
     <w:sectPr>
@@ -1138,6 +1945,29 @@
       <w:spacing w:val="5"/>
     </w:rPr>
   </w:style>
+  <w:style w:type="character" w:styleId="Hipervnculo">
+    <w:name w:val="Hyperlink"/>
+    <w:basedOn w:val="Fuentedeprrafopredeter"/>
+    <w:uiPriority w:val="99"/>
+    <w:unhideWhenUsed/>
+    <w:rsid w:val="00774B8C"/>
+    <w:rPr>
+      <w:color w:val="467886" w:themeColor="hyperlink"/>
+      <w:u w:val="single"/>
+    </w:rPr>
+  </w:style>
+  <w:style w:type="character" w:styleId="Mencinsinresolver">
+    <w:name w:val="Unresolved Mention"/>
+    <w:basedOn w:val="Fuentedeprrafopredeter"/>
+    <w:uiPriority w:val="99"/>
+    <w:semiHidden/>
+    <w:unhideWhenUsed/>
+    <w:rsid w:val="00774B8C"/>
+    <w:rPr>
+      <w:color w:val="605E5C"/>
+      <w:shd w:val="clear" w:color="auto" w:fill="E1DFDD"/>
+    </w:rPr>
+  </w:style>
 </w:styles>
 </file>
 

</xml_diff>